<commit_message>
midterm report and a liitle change in dashboard
</commit_message>
<xml_diff>
--- a/DocumentsAndReports/draft_midterm_report.docx
+++ b/DocumentsAndReports/draft_midterm_report.docx
@@ -130,23 +130,14 @@
           <w:rStyle w:val="citation-284"/>
           <w:rFonts w:ascii="Calibri" w:eastAsiaTheme="majorEastAsia" w:hAnsi="Calibri" w:cs="Calibri"/>
         </w:rPr>
-        <w:t xml:space="preserve"> [</w:t>
+        <w:t xml:space="preserve"> </w:t>
       </w:r>
       <w:r>
         <w:rPr>
           <w:rStyle w:val="citation-284"/>
           <w:rFonts w:ascii="Calibri" w:eastAsiaTheme="majorEastAsia" w:hAnsi="Calibri" w:cs="Calibri"/>
-          <w:b/>
-          <w:bCs/>
-        </w:rPr>
-        <w:t>CLICK HERE TO VIEW VIDEO</w:t>
-      </w:r>
-      <w:r>
-        <w:rPr>
-          <w:rStyle w:val="citation-284"/>
-          <w:rFonts w:ascii="Calibri" w:eastAsiaTheme="majorEastAsia" w:hAnsi="Calibri" w:cs="Calibri"/>
-        </w:rPr>
-        <w:t xml:space="preserve">] </w:t>
+        </w:rPr>
+        <w:t>https://www.youtube.com/watch?v=oxOyr0G2azQ</w:t>
       </w:r>
     </w:p>
     <w:p>
@@ -172,23 +163,14 @@
           <w:rStyle w:val="citation-283"/>
           <w:rFonts w:ascii="Calibri" w:eastAsiaTheme="majorEastAsia" w:hAnsi="Calibri" w:cs="Calibri"/>
         </w:rPr>
-        <w:t xml:space="preserve"> [</w:t>
+        <w:t xml:space="preserve"> </w:t>
       </w:r>
       <w:r>
         <w:rPr>
           <w:rStyle w:val="citation-283"/>
           <w:rFonts w:ascii="Calibri" w:eastAsiaTheme="majorEastAsia" w:hAnsi="Calibri" w:cs="Calibri"/>
-          <w:b/>
-          <w:bCs/>
-        </w:rPr>
-        <w:t>LINK TO REPOSITORY</w:t>
-      </w:r>
-      <w:r>
-        <w:rPr>
-          <w:rStyle w:val="citation-283"/>
-          <w:rFonts w:ascii="Calibri" w:eastAsiaTheme="majorEastAsia" w:hAnsi="Calibri" w:cs="Calibri"/>
-        </w:rPr>
-        <w:t xml:space="preserve">] </w:t>
+        </w:rPr>
+        <w:t>https://github.com/MichaelHein915/W26_4495_S3_MichaelH</w:t>
       </w:r>
     </w:p>
     <w:sdt>
@@ -12584,7 +12566,7 @@
 </file>
 
 <file path=customXml/itemProps1.xml><?xml version="1.0" encoding="utf-8"?>
-<ds:datastoreItem xmlns:ds="http://schemas.openxmlformats.org/officeDocument/2006/customXml" ds:itemID="{E4D561D6-867B-5940-874F-F57A1A72619C}">
+<ds:datastoreItem xmlns:ds="http://schemas.openxmlformats.org/officeDocument/2006/customXml" ds:itemID="{58EE3F92-151F-494A-A1B0-A057CAF3B4A0}">
   <ds:schemaRefs>
     <ds:schemaRef ds:uri="http://schemas.openxmlformats.org/officeDocument/2006/bibliography"/>
   </ds:schemaRefs>

</xml_diff>